<commit_message>
Actualizar URL DockerHub a jeshuarg/adoptme-backend-iii
- README, docker-compose, documento Word y entregable apuntan al repositorio
  publicado en https://hub.docker.com/r/jeshuarg/adoptme-backend-iii
- Se agrega evidencia/docker-push.log con el log del push 1.0.0 y latest.
</commit_message>
<xml_diff>
--- a/Entregable-Final-Backend-III.docx
+++ b/Entregable-Final-Backend-III.docx
@@ -52,7 +52,7 @@
         </w:p>
       </w:sdtContent>
     </w:sdt>
-    <w:bookmarkStart w:id="46" w:name="adoptme-api-entregable-final-backend-iii"/>
+    <w:bookmarkStart w:id="47" w:name="adoptme-api-entregable-final-backend-iii"/>
     <w:p>
       <w:pPr>
         <w:pStyle w:val="Heading1"/>
@@ -16300,7 +16300,7 @@
         <w:rPr>
           <w:rStyle w:val="VerbatimChar"/>
         </w:rPr>
-        <w:t xml:space="preserve">$ docker build -t jeshuaromero/adoptme-backend-iii:1.0.0 \</w:t>
+        <w:t xml:space="preserve">$ docker build -t jeshuarg/adoptme-backend-iii:1.0.0 \</w:t>
       </w:r>
       <w:r>
         <w:br/>
@@ -16309,7 +16309,7 @@
         <w:rPr>
           <w:rStyle w:val="VerbatimChar"/>
         </w:rPr>
-        <w:t xml:space="preserve">               -t jeshuaromero/adoptme-backend-iii:latest .</w:t>
+        <w:t xml:space="preserve">               -t jeshuarg/adoptme-backend-iii:latest .</w:t>
       </w:r>
       <w:r>
         <w:br/>
@@ -16492,7 +16492,7 @@
         <w:rPr>
           <w:rStyle w:val="VerbatimChar"/>
         </w:rPr>
-        <w:t xml:space="preserve">   naming to docker.io/jeshuaromero/adoptme-backend-iii:1.0.0</w:t>
+        <w:t xml:space="preserve">   naming to docker.io/jeshuarg/adoptme-backend-iii:1.0.0</w:t>
       </w:r>
       <w:r>
         <w:br/>
@@ -16501,7 +16501,7 @@
         <w:rPr>
           <w:rStyle w:val="VerbatimChar"/>
         </w:rPr>
-        <w:t xml:space="preserve">   naming to docker.io/jeshuaromero/adoptme-backend-iii:latest</w:t>
+        <w:t xml:space="preserve">   naming to docker.io/jeshuarg/adoptme-backend-iii:latest</w:t>
       </w:r>
     </w:p>
     <w:p>
@@ -16513,7 +16513,7 @@
     </w:p>
     <w:bookmarkEnd w:id="33"/>
     <w:bookmarkEnd w:id="34"/>
-    <w:bookmarkStart w:id="38" w:name="imagen-docker"/>
+    <w:bookmarkStart w:id="39" w:name="imagen-docker"/>
     <w:p>
       <w:pPr>
         <w:pStyle w:val="Heading2"/>
@@ -16582,7 +16582,7 @@
               <w:rPr>
                 <w:rStyle w:val="VerbatimChar"/>
               </w:rPr>
-              <w:t xml:space="preserve">jeshuaromero/adoptme-backend-iii</w:t>
+              <w:t xml:space="preserve">jeshuarg/adoptme-backend-iii</w:t>
             </w:r>
           </w:p>
         </w:tc>
@@ -16634,7 +16634,7 @@
               <w:pStyle w:val="Compact"/>
             </w:pPr>
             <w:r>
-              <w:t xml:space="preserve">Tamaño final</w:t>
+              <w:t xml:space="preserve">Tamaño</w:t>
             </w:r>
           </w:p>
         </w:tc>
@@ -16645,7 +16645,7 @@
               <w:pStyle w:val="Compact"/>
             </w:pPr>
             <w:r>
-              <w:t xml:space="preserve">299 MB</w:t>
+              <w:t xml:space="preserve">~65 MB comprimida / 299 MB descomprimida</w:t>
             </w:r>
           </w:p>
         </w:tc>
@@ -16673,7 +16673,7 @@
                 <w:rPr>
                   <w:rStyle w:val="Hyperlink"/>
                 </w:rPr>
-                <w:t xml:space="preserve">https://hub.docker.com/r/jeshuaromero/adoptme-backend-iii</w:t>
+                <w:t xml:space="preserve">https://hub.docker.com/r/jeshuarg/adoptme-backend-iii</w:t>
               </w:r>
             </w:hyperlink>
           </w:p>
@@ -16701,13 +16701,42 @@
               <w:rPr>
                 <w:rStyle w:val="VerbatimChar"/>
               </w:rPr>
-              <w:t xml:space="preserve">docker pull jeshuaromero/adoptme-backend-iii:1.0.0</w:t>
+              <w:t xml:space="preserve">docker pull jeshuarg/adoptme-backend-iii:1.0.0</w:t>
             </w:r>
           </w:p>
         </w:tc>
       </w:tr>
+      <w:tr>
+        <w:tc>
+          <w:tcPr/>
+          <w:p>
+            <w:pPr>
+              <w:pStyle w:val="Compact"/>
+            </w:pPr>
+            <w:r>
+              <w:t xml:space="preserve">Repo GitHub</w:t>
+            </w:r>
+          </w:p>
+        </w:tc>
+        <w:tc>
+          <w:tcPr/>
+          <w:p>
+            <w:pPr>
+              <w:pStyle w:val="Compact"/>
+            </w:pPr>
+            <w:hyperlink r:id="rId36">
+              <w:r>
+                <w:rPr>
+                  <w:rStyle w:val="Hyperlink"/>
+                </w:rPr>
+                <w:t xml:space="preserve">https://github.com/Jeshua-Romero-Guadarrama/adoptme-backend-iii</w:t>
+              </w:r>
+            </w:hyperlink>
+          </w:p>
+        </w:tc>
+      </w:tr>
     </w:tbl>
-    <w:bookmarkStart w:id="36" w:name="evidencia-de-build"/>
+    <w:bookmarkStart w:id="37" w:name="evidencia-de-build"/>
     <w:p>
       <w:pPr>
         <w:pStyle w:val="Heading3"/>
@@ -16724,7 +16753,7 @@
         <w:rPr>
           <w:rStyle w:val="VerbatimChar"/>
         </w:rPr>
-        <w:t xml:space="preserve">$ docker images jeshuaromero/adoptme-backend-iii --format "{{.Repository}}:{{.Tag}}\t{{.Size}}"</w:t>
+        <w:t xml:space="preserve">$ docker images jeshuarg/adoptme-backend-iii --format "{{.Repository}}:{{.Tag}}\t{{.Size}}"</w:t>
       </w:r>
       <w:r>
         <w:br/>
@@ -16733,7 +16762,7 @@
         <w:rPr>
           <w:rStyle w:val="VerbatimChar"/>
         </w:rPr>
-        <w:t xml:space="preserve">jeshuaromero/adoptme-backend-iii:1.0.0   299MB</w:t>
+        <w:t xml:space="preserve">jeshuarg/adoptme-backend-iii:1.0.0   299MB</w:t>
       </w:r>
       <w:r>
         <w:br/>
@@ -16742,11 +16771,53 @@
         <w:rPr>
           <w:rStyle w:val="VerbatimChar"/>
         </w:rPr>
-        <w:t xml:space="preserve">jeshuaromero/adoptme-backend-iii:latest  299MB</w:t>
+        <w:t xml:space="preserve">jeshuarg/adoptme-backend-iii:latest  299MB</w:t>
+      </w:r>
+      <w:r>
+        <w:br/>
+      </w:r>
+      <w:r>
+        <w:br/>
+      </w:r>
+      <w:r>
+        <w:rPr>
+          <w:rStyle w:val="VerbatimChar"/>
+        </w:rPr>
+        <w:t xml:space="preserve">$ docker push jeshuarg/adoptme-backend-iii:1.0.0</w:t>
+      </w:r>
+      <w:r>
+        <w:br/>
+      </w:r>
+      <w:r>
+        <w:rPr>
+          <w:rStyle w:val="VerbatimChar"/>
+        </w:rPr>
+        <w:t xml:space="preserve">1.0.0: digest: sha256:844cf7845df191386a24f74b09c3423113e6bc698a3519fa02de0eb1057f4b50 size: 856</w:t>
+      </w:r>
+      <w:r>
+        <w:br/>
+      </w:r>
+      <w:r>
+        <w:br/>
+      </w:r>
+      <w:r>
+        <w:rPr>
+          <w:rStyle w:val="VerbatimChar"/>
+        </w:rPr>
+        <w:t xml:space="preserve">$ docker push jeshuarg/adoptme-backend-iii:latest</w:t>
+      </w:r>
+      <w:r>
+        <w:br/>
+      </w:r>
+      <w:r>
+        <w:rPr>
+          <w:rStyle w:val="VerbatimChar"/>
+        </w:rPr>
+        <w:t xml:space="preserve">latest: digest: sha256:844cf7845df191386a24f74b09c3423113e6bc698a3519fa02de0eb1057f4b50 size: 856</w:t>
       </w:r>
     </w:p>
-    <w:bookmarkEnd w:id="36"/>
-    <w:bookmarkStart w:id="37" w:name="evidencia-de-ejecución-del-contenedor"/>
+    <w:bookmarkEnd w:id="37"/>
+    <w:bookmarkStart w:id="38" w:name="evidencia-de-ejecución-del-contenedor"/>
     <w:p>
       <w:pPr>
         <w:pStyle w:val="Heading3"/>
@@ -16763,7 +16834,7 @@
         <w:rPr>
           <w:rStyle w:val="VerbatimChar"/>
         </w:rPr>
-        <w:t xml:space="preserve">$ docker run --rm -d --name adoptme-prueba -p 8080:8080 jeshuaromero/adoptme-backend-iii:1.0.0</w:t>
+        <w:t xml:space="preserve">$ docker run --rm -d --name adoptme-prueba -p 8080:8080 jeshuarg/adoptme-backend-iii:1.0.0</w:t>
       </w:r>
       <w:r>
         <w:br/>
@@ -16968,9 +17039,9 @@
         </w:pict>
       </w:r>
     </w:p>
-    <w:bookmarkEnd w:id="37"/>
     <w:bookmarkEnd w:id="38"/>
-    <w:bookmarkStart w:id="44" w:name="ejecución-del-proyecto"/>
+    <w:bookmarkEnd w:id="39"/>
+    <w:bookmarkStart w:id="45" w:name="ejecución-del-proyecto"/>
     <w:p>
       <w:pPr>
         <w:pStyle w:val="Heading2"/>
@@ -16979,7 +17050,7 @@
         <w:t xml:space="preserve">6. Ejecución del proyecto</w:t>
       </w:r>
     </w:p>
-    <w:bookmarkStart w:id="39" w:name="construir-la-imagen"/>
+    <w:bookmarkStart w:id="40" w:name="construir-la-imagen"/>
     <w:p>
       <w:pPr>
         <w:pStyle w:val="Heading3"/>
@@ -17008,7 +17079,7 @@
         <w:rPr>
           <w:rStyle w:val="NormalTok"/>
         </w:rPr>
-        <w:t xml:space="preserve">t jeshuaromero</w:t>
+        <w:t xml:space="preserve">t jeshuarg</w:t>
       </w:r>
       <w:r>
         <w:rPr>
@@ -17071,7 +17142,7 @@
         <w:rPr>
           <w:rStyle w:val="NormalTok"/>
         </w:rPr>
-        <w:t xml:space="preserve">t jeshuaromero</w:t>
+        <w:t xml:space="preserve">t jeshuarg</w:t>
       </w:r>
       <w:r>
         <w:rPr>
@@ -17104,8 +17175,8 @@
         <w:t xml:space="preserve">.</w:t>
       </w:r>
     </w:p>
-    <w:bookmarkEnd w:id="39"/>
-    <w:bookmarkStart w:id="40" w:name="ejecutar-el-contenedor"/>
+    <w:bookmarkEnd w:id="40"/>
+    <w:bookmarkStart w:id="41" w:name="ejecutar-el-contenedor"/>
     <w:p>
       <w:pPr>
         <w:pStyle w:val="Heading3"/>
@@ -17170,7 +17241,7 @@
         <w:rPr>
           <w:rStyle w:val="NormalTok"/>
         </w:rPr>
-        <w:t xml:space="preserve"> jeshuaromero</w:t>
+        <w:t xml:space="preserve"> jeshuarg</w:t>
       </w:r>
       <w:r>
         <w:rPr>
@@ -17240,8 +17311,8 @@
         <w:t xml:space="preserve">build</w:t>
       </w:r>
     </w:p>
-    <w:bookmarkEnd w:id="40"/>
-    <w:bookmarkStart w:id="41" w:name="correr-los-tests"/>
+    <w:bookmarkEnd w:id="41"/>
+    <w:bookmarkStart w:id="42" w:name="correr-los-tests"/>
     <w:p>
       <w:pPr>
         <w:pStyle w:val="Heading3"/>
@@ -17448,8 +17519,8 @@
         <w:t xml:space="preserve">33 passing (306ms)</w:t>
       </w:r>
     </w:p>
-    <w:bookmarkEnd w:id="41"/>
-    <w:bookmarkStart w:id="42" w:name="subir-a-dockerhub"/>
+    <w:bookmarkEnd w:id="42"/>
+    <w:bookmarkStart w:id="43" w:name="subir-a-dockerhub"/>
     <w:p>
       <w:pPr>
         <w:pStyle w:val="Heading3"/>
@@ -17466,16 +17537,28 @@
         <w:rPr>
           <w:rStyle w:val="NormalTok"/>
         </w:rPr>
-        <w:t xml:space="preserve">docker login</w:t>
-      </w:r>
-      <w:r>
-        <w:br/>
-      </w:r>
-      <w:r>
-        <w:rPr>
-          <w:rStyle w:val="NormalTok"/>
-        </w:rPr>
-        <w:t xml:space="preserve">docker push jeshuaromero</w:t>
+        <w:t xml:space="preserve">docker login </w:t>
+      </w:r>
+      <w:r>
+        <w:rPr>
+          <w:rStyle w:val="OperatorTok"/>
+        </w:rPr>
+        <w:t xml:space="preserve">-</w:t>
+      </w:r>
+      <w:r>
+        <w:rPr>
+          <w:rStyle w:val="NormalTok"/>
+        </w:rPr>
+        <w:t xml:space="preserve">u jeshuarg</w:t>
+      </w:r>
+      <w:r>
+        <w:br/>
+      </w:r>
+      <w:r>
+        <w:rPr>
+          <w:rStyle w:val="NormalTok"/>
+        </w:rPr>
+        <w:t xml:space="preserve">docker push jeshuarg</w:t>
       </w:r>
       <w:r>
         <w:rPr>
@@ -17526,7 +17609,7 @@
         <w:rPr>
           <w:rStyle w:val="NormalTok"/>
         </w:rPr>
-        <w:t xml:space="preserve"> push jeshuaromero</w:t>
+        <w:t xml:space="preserve"> push jeshuarg</w:t>
       </w:r>
       <w:r>
         <w:rPr>
@@ -17553,8 +17636,8 @@
         <w:t xml:space="preserve">latest</w:t>
       </w:r>
     </w:p>
-    <w:bookmarkEnd w:id="42"/>
-    <w:bookmarkStart w:id="43" w:name="escaneo-de-vulnerabilidades"/>
+    <w:bookmarkEnd w:id="43"/>
+    <w:bookmarkStart w:id="44" w:name="escaneo-de-vulnerabilidades"/>
     <w:p>
       <w:pPr>
         <w:pStyle w:val="Heading3"/>
@@ -17571,7 +17654,7 @@
         <w:rPr>
           <w:rStyle w:val="NormalTok"/>
         </w:rPr>
-        <w:t xml:space="preserve">docker scout quickview jeshuaromero</w:t>
+        <w:t xml:space="preserve">docker scout quickview jeshuarg</w:t>
       </w:r>
       <w:r>
         <w:rPr>
@@ -17622,7 +17705,7 @@
         <w:rPr>
           <w:rStyle w:val="NormalTok"/>
         </w:rPr>
-        <w:t xml:space="preserve"> scout cves      jeshuaromero</w:t>
+        <w:t xml:space="preserve"> scout cves      jeshuarg</w:t>
       </w:r>
       <w:r>
         <w:rPr>
@@ -17668,9 +17751,9 @@
         </w:pict>
       </w:r>
     </w:p>
-    <w:bookmarkEnd w:id="43"/>
     <w:bookmarkEnd w:id="44"/>
-    <w:bookmarkStart w:id="45" w:name="readme.md"/>
+    <w:bookmarkEnd w:id="45"/>
+    <w:bookmarkStart w:id="46" w:name="readme.md"/>
     <w:p>
       <w:pPr>
         <w:pStyle w:val="Heading2"/>
@@ -18046,7 +18129,7 @@
         <w:rPr>
           <w:rStyle w:val="NormalTok"/>
         </w:rPr>
-        <w:t xml:space="preserve">Repositorio: jeshuaromero/adoptme-backend-iii</w:t>
+        <w:t xml:space="preserve">Repositorio: jeshuarg/adoptme-backend-iii</w:t>
       </w:r>
       <w:r>
         <w:br/>
@@ -18076,7 +18159,7 @@
         <w:rPr>
           <w:rStyle w:val="NormalTok"/>
         </w:rPr>
-        <w:t xml:space="preserve">URL: https://hub.docker.com/r/jeshuaromero/adoptme-backend-iii</w:t>
+        <w:t xml:space="preserve">URL: https://hub.docker.com/r/jeshuarg/adoptme-backend-iii</w:t>
       </w:r>
       <w:r>
         <w:br/>
@@ -18091,7 +18174,22 @@
         <w:rPr>
           <w:rStyle w:val="NormalTok"/>
         </w:rPr>
-        <w:t xml:space="preserve">Pull: docker pull jeshuaromero/adoptme-backend-iii:1.0.0</w:t>
+        <w:t xml:space="preserve">Pull: docker pull jeshuarg/adoptme-backend-iii:1.0.0</w:t>
+      </w:r>
+      <w:r>
+        <w:br/>
+      </w:r>
+      <w:r>
+        <w:rPr>
+          <w:rStyle w:val="SpecialStringTok"/>
+        </w:rPr>
+        <w:t xml:space="preserve">- </w:t>
+      </w:r>
+      <w:r>
+        <w:rPr>
+          <w:rStyle w:val="NormalTok"/>
+        </w:rPr>
+        <w:t xml:space="preserve">Repo GitHub: https://github.com/Jeshua-Romero-Guadarrama/adoptme-backend-iii</w:t>
       </w:r>
       <w:r>
         <w:br/>
@@ -18154,7 +18252,7 @@
         <w:rPr>
           <w:rStyle w:val="NormalTok"/>
         </w:rPr>
-        <w:t xml:space="preserve">docker build -t jeshuaromero/adoptme-backend-iii:1.0.0 .</w:t>
+        <w:t xml:space="preserve">docker build -t jeshuarg/adoptme-backend-iii:1.0.0 .</w:t>
       </w:r>
       <w:r>
         <w:br/>
@@ -18175,7 +18273,7 @@
         <w:rPr>
           <w:rStyle w:val="NormalTok"/>
         </w:rPr>
-        <w:t xml:space="preserve">docker run --rm -p 8080:8080 jeshuaromero/adoptme-backend-iii:1.0.0</w:t>
+        <w:t xml:space="preserve">docker run --rm -p 8080:8080 jeshuarg/adoptme-backend-iii:1.0.0</w:t>
       </w:r>
       <w:r>
         <w:br/>
@@ -18208,29 +18306,20 @@
         <w:rPr>
           <w:rStyle w:val="FunctionTok"/>
         </w:rPr>
-        <w:t xml:space="preserve"># Push</w:t>
-      </w:r>
-      <w:r>
-        <w:br/>
-      </w:r>
-      <w:r>
-        <w:rPr>
-          <w:rStyle w:val="NormalTok"/>
-        </w:rPr>
-        <w:t xml:space="preserve">docker login</w:t>
-      </w:r>
-      <w:r>
-        <w:br/>
-      </w:r>
-      <w:r>
-        <w:rPr>
-          <w:rStyle w:val="NormalTok"/>
-        </w:rPr>
-        <w:t xml:space="preserve">docker push jeshuaromero/adoptme-backend-iii:1.0.0</w:t>
+        <w:t xml:space="preserve"># Pull (publicada en DockerHub)</w:t>
+      </w:r>
+      <w:r>
+        <w:br/>
+      </w:r>
+      <w:r>
+        <w:rPr>
+          <w:rStyle w:val="NormalTok"/>
+        </w:rPr>
+        <w:t xml:space="preserve">docker pull jeshuarg/adoptme-backend-iii:1.0.0</w:t>
       </w:r>
     </w:p>
-    <w:bookmarkEnd w:id="45"/>
     <w:bookmarkEnd w:id="46"/>
+    <w:bookmarkEnd w:id="47"/>
     <w:sectPr/>
   </w:body>
 </w:document>

</xml_diff>

<commit_message>
Bumpear deps a 1.0.1 sin vulnerabilidades en produccion
- Imagen 1.0.1 publicada en https://hub.docker.com/r/jeshuarg/adoptme-backend-iii
- bcrypt 6, multer 2.1.1, express 4.22.1, helmet 8, cookie-parser 1.4.7,
  compression 1.8.1, mongoose 8.18.3, rate-limit 7.5.1, morgan 1.10.1.
- npm audit --omit=dev: 0 vulnerabilidades.
- 33 tests funcionales y unitarios verdes con las nuevas versiones.
- Evidencia actualizada: docker-build/run/pull/push, npm-audit antes/despues, arbol.
- Pull desde maquina limpia validado: docker pull + run + curl /health 200.
</commit_message>
<xml_diff>
--- a/Entregable-Final-Backend-III.docx
+++ b/Entregable-Final-Backend-III.docx
@@ -16300,7 +16300,7 @@
         <w:rPr>
           <w:rStyle w:val="VerbatimChar"/>
         </w:rPr>
-        <w:t xml:space="preserve">$ docker build -t jeshuarg/adoptme-backend-iii:1.0.0 \</w:t>
+        <w:t xml:space="preserve">$ docker build -t jeshuarg/adoptme-backend-iii:1.0.1 \</w:t>
       </w:r>
       <w:r>
         <w:br/>
@@ -16492,7 +16492,7 @@
         <w:rPr>
           <w:rStyle w:val="VerbatimChar"/>
         </w:rPr>
-        <w:t xml:space="preserve">   naming to docker.io/jeshuarg/adoptme-backend-iii:1.0.0</w:t>
+        <w:t xml:space="preserve">   naming to docker.io/jeshuarg/adoptme-backend-iii:1.0.1</w:t>
       </w:r>
       <w:r>
         <w:br/>
@@ -16605,6 +16605,18 @@
             <w:pPr>
               <w:pStyle w:val="Compact"/>
             </w:pPr>
+            <w:r>
+              <w:rPr>
+                <w:rStyle w:val="VerbatimChar"/>
+              </w:rPr>
+              <w:t xml:space="preserve">1.0.1</w:t>
+            </w:r>
+            <w:r>
+              <w:t xml:space="preserve">,</w:t>
+            </w:r>
+            <w:r>
+              <w:t xml:space="preserve"> </w:t>
+            </w:r>
             <w:r>
               <w:rPr>
                 <w:rStyle w:val="VerbatimChar"/>
@@ -16701,7 +16713,7 @@
               <w:rPr>
                 <w:rStyle w:val="VerbatimChar"/>
               </w:rPr>
-              <w:t xml:space="preserve">docker pull jeshuarg/adoptme-backend-iii:1.0.0</w:t>
+              <w:t xml:space="preserve">docker pull jeshuarg/adoptme-backend-iii:1.0.1</w:t>
             </w:r>
           </w:p>
         </w:tc>
@@ -16762,7 +16774,7 @@
         <w:rPr>
           <w:rStyle w:val="VerbatimChar"/>
         </w:rPr>
-        <w:t xml:space="preserve">jeshuarg/adoptme-backend-iii:1.0.0   299MB</w:t>
+        <w:t xml:space="preserve">jeshuarg/adoptme-backend-iii:1.0.1   299MB</w:t>
       </w:r>
       <w:r>
         <w:br/>
@@ -16783,7 +16795,7 @@
         <w:rPr>
           <w:rStyle w:val="VerbatimChar"/>
         </w:rPr>
-        <w:t xml:space="preserve">$ docker push jeshuarg/adoptme-backend-iii:1.0.0</w:t>
+        <w:t xml:space="preserve">$ docker push jeshuarg/adoptme-backend-iii:1.0.1</w:t>
       </w:r>
       <w:r>
         <w:br/>
@@ -16834,7 +16846,7 @@
         <w:rPr>
           <w:rStyle w:val="VerbatimChar"/>
         </w:rPr>
-        <w:t xml:space="preserve">$ docker run --rm -d --name adoptme-prueba -p 8080:8080 jeshuarg/adoptme-backend-iii:1.0.0</w:t>
+        <w:t xml:space="preserve">$ docker run --rm -d --name adoptme-prueba -p 8080:8080 jeshuarg/adoptme-backend-iii:1.0.1</w:t>
       </w:r>
       <w:r>
         <w:br/>
@@ -17115,7 +17127,7 @@
         <w:rPr>
           <w:rStyle w:val="DecValTok"/>
         </w:rPr>
-        <w:t xml:space="preserve">0</w:t>
+        <w:t xml:space="preserve">1</w:t>
       </w:r>
       <w:r>
         <w:rPr>
@@ -17277,7 +17289,7 @@
         <w:rPr>
           <w:rStyle w:val="DecValTok"/>
         </w:rPr>
-        <w:t xml:space="preserve">0</w:t>
+        <w:t xml:space="preserve">1</w:t>
       </w:r>
     </w:p>
     <w:p>
@@ -17594,7 +17606,7 @@
         <w:rPr>
           <w:rStyle w:val="DecValTok"/>
         </w:rPr>
-        <w:t xml:space="preserve">0</w:t>
+        <w:t xml:space="preserve">1</w:t>
       </w:r>
       <w:r>
         <w:br/>
@@ -17690,7 +17702,7 @@
         <w:rPr>
           <w:rStyle w:val="DecValTok"/>
         </w:rPr>
-        <w:t xml:space="preserve">0</w:t>
+        <w:t xml:space="preserve">1</w:t>
       </w:r>
       <w:r>
         <w:br/>
@@ -17741,7 +17753,7 @@
         <w:rPr>
           <w:rStyle w:val="DecValTok"/>
         </w:rPr>
-        <w:t xml:space="preserve">0</w:t>
+        <w:t xml:space="preserve">1</w:t>
       </w:r>
     </w:p>
     <w:p>
@@ -18174,7 +18186,7 @@
         <w:rPr>
           <w:rStyle w:val="NormalTok"/>
         </w:rPr>
-        <w:t xml:space="preserve">Pull: docker pull jeshuarg/adoptme-backend-iii:1.0.0</w:t>
+        <w:t xml:space="preserve">Pull: docker pull jeshuarg/adoptme-backend-iii:1.0.1</w:t>
       </w:r>
       <w:r>
         <w:br/>
@@ -18252,7 +18264,7 @@
         <w:rPr>
           <w:rStyle w:val="NormalTok"/>
         </w:rPr>
-        <w:t xml:space="preserve">docker build -t jeshuarg/adoptme-backend-iii:1.0.0 .</w:t>
+        <w:t xml:space="preserve">docker build -t jeshuarg/adoptme-backend-iii:1.0.1 .</w:t>
       </w:r>
       <w:r>
         <w:br/>
@@ -18273,7 +18285,7 @@
         <w:rPr>
           <w:rStyle w:val="NormalTok"/>
         </w:rPr>
-        <w:t xml:space="preserve">docker run --rm -p 8080:8080 jeshuarg/adoptme-backend-iii:1.0.0</w:t>
+        <w:t xml:space="preserve">docker run --rm -p 8080:8080 jeshuarg/adoptme-backend-iii:1.0.1</w:t>
       </w:r>
       <w:r>
         <w:br/>
@@ -18315,7 +18327,7 @@
         <w:rPr>
           <w:rStyle w:val="NormalTok"/>
         </w:rPr>
-        <w:t xml:space="preserve">docker pull jeshuarg/adoptme-backend-iii:1.0.0</w:t>
+        <w:t xml:space="preserve">docker pull jeshuarg/adoptme-backend-iii:1.0.1</w:t>
       </w:r>
     </w:p>
     <w:bookmarkEnd w:id="46"/>

</xml_diff>